<commit_message>
style: fix tab stops and spacing alignment in request form docx template
</commit_message>
<xml_diff>
--- a/แบบคำขอรับใบอนุญาต_ต่อใบอนุญาต add.docx
+++ b/แบบคำขอรับใบอนุญาต_ต่อใบอนุญาต add.docx
@@ -819,6 +819,7 @@
           <w:sz w:val="24"/>
           <w:szCs w:val="24"/>
         </w:rPr>
+        <w:tab/>
         <w:t>ที่</w:t>
       </w:r>
       <w:r>
@@ -858,7 +859,9 @@
           <w:sz w:val="24"/>
           <w:szCs w:val="24"/>
         </w:rPr>
-        <w:t xml:space="preserve"> หมู่ที่</w:t>
+        <w:tab/>
+        <w:t xml:space="preserve">หมู่ที่ </w:t>
+        <w:tab/>
       </w:r>
       <w:r>
         <w:rPr>
@@ -878,6 +881,7 @@
           <w:sz w:val="24"/>
           <w:szCs w:val="24"/>
         </w:rPr>
+        <w:tab/>
         <w:t xml:space="preserve">ตรอก/ซอย </w:t>
       </w:r>
       <w:r>
@@ -909,7 +913,8 @@
           <w:sz w:val="24"/>
           <w:szCs w:val="24"/>
         </w:rPr>
-        <w:t xml:space="preserve"> ถนน</w:t>
+        <w:tab/>
+        <w:t xml:space="preserve">ถนน </w:t>
       </w:r>
       <w:r>
         <w:rPr>
@@ -1021,7 +1026,7 @@
           <w:sz w:val="24"/>
           <w:szCs w:val="24"/>
         </w:rPr>
-        <w:t xml:space="preserve"> </w:t>
+        <w:tab/>
       </w:r>
       <w:r>
         <w:rPr>
@@ -1148,7 +1153,6 @@
           <w:cs/>
           <w:lang w:bidi="th-TH"/>
         </w:rPr>
-        <w:tab/>
       </w:r>
       <w:r>
         <w:rPr>
@@ -1161,7 +1165,6 @@
           <w:cs/>
           <w:lang w:bidi="th-TH"/>
         </w:rPr>
-        <w:tab/>
       </w:r>
     </w:p>
     <w:p>

</xml_diff>

<commit_message>
Remove dots before checkboxes and set evidence default to empty
</commit_message>
<xml_diff>
--- a/แบบคำขอรับใบอนุญาต_ต่อใบอนุญาต add.docx
+++ b/แบบคำขอรับใบอนุญาต_ต่อใบอนุญาต add.docx
@@ -1294,7 +1294,6 @@
           <w:sz w:val="24"/>
           <w:szCs w:val="24"/>
         </w:rPr>
-        <w:t xml:space="preserve">   </w:t>
       </w:r>
       <w:r>
         <w:rPr>
@@ -1389,7 +1388,6 @@
           <w:sz w:val="24"/>
           <w:szCs w:val="24"/>
         </w:rPr>
-        <w:t xml:space="preserve">   </w:t>
       </w:r>
       <w:r>
         <w:rPr>
@@ -1519,7 +1517,7 @@
           <w:sz w:val="24"/>
           <w:szCs w:val="24"/>
         </w:rPr>
-        <w:t xml:space="preserve">   {{chk_</w:t>
+        <w:t>{{chk_</w:t>
       </w:r>
       <w:r>
         <w:rPr>
@@ -1562,7 +1560,7 @@
           <w:sz w:val="24"/>
           <w:szCs w:val="24"/>
         </w:rPr>
-        <w:t xml:space="preserve">   {{chk_</w:t>
+        <w:t>{{chk_</w:t>
       </w:r>
       <w:r>
         <w:rPr>
@@ -1605,7 +1603,7 @@
           <w:sz w:val="24"/>
           <w:szCs w:val="24"/>
         </w:rPr>
-        <w:t xml:space="preserve">   {{chk_</w:t>
+        <w:t>{{chk_</w:t>
       </w:r>
       <w:r>
         <w:rPr>
@@ -1648,7 +1646,7 @@
           <w:sz w:val="24"/>
           <w:szCs w:val="24"/>
         </w:rPr>
-        <w:t xml:space="preserve">   {{chk_</w:t>
+        <w:t>{{chk_</w:t>
       </w:r>
       <w:r>
         <w:rPr>
@@ -1691,7 +1689,6 @@
           <w:sz w:val="24"/>
           <w:szCs w:val="24"/>
         </w:rPr>
-        <w:t xml:space="preserve">   </w:t>
       </w:r>
       <w:r>
         <w:rPr>

</xml_diff>